<commit_message>
fixed the names of reports
</commit_message>
<xml_diff>
--- a/Assignment 1/report.docx
+++ b/Assignment 1/report.docx
@@ -169,6 +169,34 @@
     <w:p>
       <w:pPr>
         <w:rPr>
+          <w:highlight w:val="darkRed"/>
+        </w:rPr>
+      </w:pPr>
+      <w:r>
+        <w:rPr>
+          <w:highlight w:val="darkRed"/>
+        </w:rPr>
+        <w:t>A system-level diagram illustrating tasks, ISRs, and communication paths is provided below.</w:t>
+      </w:r>
+    </w:p>
+    <w:p>
+      <w:pPr>
+        <w:rPr>
+          <w:highlight w:val="darkRed"/>
+        </w:rPr>
+      </w:pPr>
+    </w:p>
+    <w:p>
+      <w:r>
+        <w:rPr>
+          <w:highlight w:val="darkRed"/>
+        </w:rPr>
+        <w:t>[Insert final system diagram here]</w:t>
+      </w:r>
+    </w:p>
+    <w:p>
+      <w:pPr>
+        <w:rPr>
           <w:b/>
           <w:bCs/>
         </w:rPr>
@@ -231,6 +259,7 @@
           <w:b/>
           <w:bCs/>
         </w:rPr>
+        <w:lastRenderedPageBreak/>
         <w:t>KeyboardISR</w:t>
       </w:r>
       <w:proofErr w:type="spellEnd"/>
@@ -267,7 +296,6 @@
           <w:b/>
           <w:bCs/>
         </w:rPr>
-        <w:lastRenderedPageBreak/>
         <w:t>FreeRTOS</w:t>
       </w:r>
       <w:proofErr w:type="spellEnd"/>
@@ -401,7 +429,15 @@
     </w:p>
     <w:p>
       <w:r>
-        <w:t>Tasks are classified as either periodic or event-driven.</w:t>
+        <w:t xml:space="preserve">Tasks are classified as either periodic or </w:t>
+      </w:r>
+      <w:proofErr w:type="gramStart"/>
+      <w:r>
+        <w:t>event-driven</w:t>
+      </w:r>
+      <w:proofErr w:type="gramEnd"/>
+      <w:r>
+        <w:t>.</w:t>
       </w:r>
     </w:p>
     <w:p>
@@ -477,6 +513,14 @@
     <w:p>
       <w:r>
         <w:t>This separation ensures efficient CPU usage and responsiveness to real-time events.</w:t>
+      </w:r>
+    </w:p>
+    <w:p>
+      <w:r>
+        <w:t>Task Execution Conditions</w:t>
+      </w:r>
+      <w:r>
+        <w:t>:</w:t>
       </w:r>
     </w:p>
     <w:p>
@@ -489,6 +533,7 @@
       </w:pPr>
       <w:proofErr w:type="spellStart"/>
       <w:r>
+        <w:lastRenderedPageBreak/>
         <w:t>FrequencyTask</w:t>
       </w:r>
       <w:proofErr w:type="spellEnd"/>
@@ -574,7 +619,6 @@
       </w:pPr>
       <w:proofErr w:type="spellStart"/>
       <w:r>
-        <w:lastRenderedPageBreak/>
         <w:t>SwitchPollTask</w:t>
       </w:r>
       <w:proofErr w:type="spellEnd"/>
@@ -645,28 +689,79 @@
     </w:p>
     <w:p>
       <w:pPr>
+        <w:pStyle w:val="ListParagraph"/>
+        <w:numPr>
+          <w:ilvl w:val="0"/>
+          <w:numId w:val="14"/>
+        </w:numPr>
         <w:rPr>
           <w:rFonts w:hint="eastAsia"/>
         </w:rPr>
       </w:pPr>
+      <w:proofErr w:type="spellStart"/>
       <w:r>
         <w:rPr>
           <w:rFonts w:hint="eastAsia"/>
         </w:rPr>
-        <w:t xml:space="preserve">- </w:t>
+        <w:t>FrequencyRelayISR</w:t>
+      </w:r>
+      <w:proofErr w:type="spellEnd"/>
+      <w:r>
+        <w:rPr>
+          <w:rFonts w:hint="eastAsia"/>
+        </w:rPr>
+        <w:t xml:space="preserve"> </w:t>
+      </w:r>
+      <w:r>
+        <w:rPr>
+          <w:rFonts w:hint="eastAsia"/>
+        </w:rPr>
+        <w:t>→</w:t>
+      </w:r>
+      <w:r>
+        <w:rPr>
+          <w:rFonts w:hint="eastAsia"/>
+        </w:rPr>
+        <w:t xml:space="preserve"> </w:t>
       </w:r>
       <w:proofErr w:type="spellStart"/>
       <w:r>
         <w:rPr>
           <w:rFonts w:hint="eastAsia"/>
         </w:rPr>
-        <w:t>FrequencyRelayISR</w:t>
+        <w:t>FrequencyTask</w:t>
       </w:r>
       <w:proofErr w:type="spellEnd"/>
       <w:r>
         <w:rPr>
           <w:rFonts w:hint="eastAsia"/>
         </w:rPr>
+        <w:t xml:space="preserve"> (sample count values)</w:t>
+      </w:r>
+    </w:p>
+    <w:p>
+      <w:pPr>
+        <w:pStyle w:val="ListParagraph"/>
+        <w:numPr>
+          <w:ilvl w:val="0"/>
+          <w:numId w:val="14"/>
+        </w:numPr>
+        <w:rPr>
+          <w:rFonts w:hint="eastAsia"/>
+        </w:rPr>
+      </w:pPr>
+      <w:proofErr w:type="spellStart"/>
+      <w:r>
+        <w:rPr>
+          <w:rFonts w:hint="eastAsia"/>
+        </w:rPr>
+        <w:t>FrequencyTask</w:t>
+      </w:r>
+      <w:proofErr w:type="spellEnd"/>
+      <w:r>
+        <w:rPr>
+          <w:rFonts w:hint="eastAsia"/>
+        </w:rPr>
         <w:t xml:space="preserve"> </w:t>
       </w:r>
       <w:r>
@@ -686,40 +781,91 @@
         <w:rPr>
           <w:rFonts w:hint="eastAsia"/>
         </w:rPr>
-        <w:t>FrequencyTask</w:t>
+        <w:t>ROCOFTask</w:t>
       </w:r>
       <w:proofErr w:type="spellEnd"/>
       <w:r>
         <w:rPr>
           <w:rFonts w:hint="eastAsia"/>
         </w:rPr>
-        <w:t xml:space="preserve"> (sample count values)</w:t>
-      </w:r>
-    </w:p>
-    <w:p>
-      <w:pPr>
+        <w:t xml:space="preserve"> (frequency values)</w:t>
+      </w:r>
+    </w:p>
+    <w:p>
+      <w:pPr>
+        <w:pStyle w:val="ListParagraph"/>
+        <w:numPr>
+          <w:ilvl w:val="0"/>
+          <w:numId w:val="14"/>
+        </w:numPr>
         <w:rPr>
           <w:rFonts w:hint="eastAsia"/>
         </w:rPr>
       </w:pPr>
+      <w:proofErr w:type="spellStart"/>
       <w:r>
         <w:rPr>
           <w:rFonts w:hint="eastAsia"/>
         </w:rPr>
-        <w:t xml:space="preserve">- </w:t>
+        <w:t>ROCOFTask</w:t>
+      </w:r>
+      <w:proofErr w:type="spellEnd"/>
+      <w:r>
+        <w:rPr>
+          <w:rFonts w:hint="eastAsia"/>
+        </w:rPr>
+        <w:t xml:space="preserve"> </w:t>
+      </w:r>
+      <w:r>
+        <w:rPr>
+          <w:rFonts w:hint="eastAsia"/>
+        </w:rPr>
+        <w:t>→</w:t>
+      </w:r>
+      <w:r>
+        <w:rPr>
+          <w:rFonts w:hint="eastAsia"/>
+        </w:rPr>
+        <w:t xml:space="preserve"> </w:t>
       </w:r>
       <w:proofErr w:type="spellStart"/>
       <w:r>
         <w:rPr>
           <w:rFonts w:hint="eastAsia"/>
         </w:rPr>
-        <w:t>FrequencyTask</w:t>
+        <w:t>DecisionTask</w:t>
       </w:r>
       <w:proofErr w:type="spellEnd"/>
       <w:r>
         <w:rPr>
           <w:rFonts w:hint="eastAsia"/>
         </w:rPr>
+        <w:t xml:space="preserve"> (ROCOF values)</w:t>
+      </w:r>
+    </w:p>
+    <w:p>
+      <w:pPr>
+        <w:pStyle w:val="ListParagraph"/>
+        <w:numPr>
+          <w:ilvl w:val="0"/>
+          <w:numId w:val="14"/>
+        </w:numPr>
+        <w:rPr>
+          <w:rFonts w:hint="eastAsia"/>
+        </w:rPr>
+      </w:pPr>
+      <w:proofErr w:type="spellStart"/>
+      <w:r>
+        <w:rPr>
+          <w:rFonts w:hint="eastAsia"/>
+        </w:rPr>
+        <w:t>DecisionTask</w:t>
+      </w:r>
+      <w:proofErr w:type="spellEnd"/>
+      <w:r>
+        <w:rPr>
+          <w:rFonts w:hint="eastAsia"/>
+        </w:rPr>
         <w:t xml:space="preserve"> </w:t>
       </w:r>
       <w:r>
@@ -739,134 +885,27 @@
         <w:rPr>
           <w:rFonts w:hint="eastAsia"/>
         </w:rPr>
-        <w:t>ROCOFTask</w:t>
+        <w:t>LoadControlTask</w:t>
       </w:r>
       <w:proofErr w:type="spellEnd"/>
       <w:r>
         <w:rPr>
           <w:rFonts w:hint="eastAsia"/>
         </w:rPr>
-        <w:t xml:space="preserve"> (frequency values)</w:t>
-      </w:r>
-    </w:p>
-    <w:p>
-      <w:pPr>
+        <w:t xml:space="preserve"> (load commands)</w:t>
+      </w:r>
+    </w:p>
+    <w:p>
+      <w:pPr>
+        <w:pStyle w:val="ListParagraph"/>
+        <w:numPr>
+          <w:ilvl w:val="0"/>
+          <w:numId w:val="14"/>
+        </w:numPr>
         <w:rPr>
           <w:rFonts w:hint="eastAsia"/>
         </w:rPr>
       </w:pPr>
-      <w:r>
-        <w:rPr>
-          <w:rFonts w:hint="eastAsia"/>
-        </w:rPr>
-        <w:t xml:space="preserve">- </w:t>
-      </w:r>
-      <w:proofErr w:type="spellStart"/>
-      <w:r>
-        <w:rPr>
-          <w:rFonts w:hint="eastAsia"/>
-        </w:rPr>
-        <w:t>ROCOFTask</w:t>
-      </w:r>
-      <w:proofErr w:type="spellEnd"/>
-      <w:r>
-        <w:rPr>
-          <w:rFonts w:hint="eastAsia"/>
-        </w:rPr>
-        <w:t xml:space="preserve"> </w:t>
-      </w:r>
-      <w:r>
-        <w:rPr>
-          <w:rFonts w:hint="eastAsia"/>
-        </w:rPr>
-        <w:t>→</w:t>
-      </w:r>
-      <w:r>
-        <w:rPr>
-          <w:rFonts w:hint="eastAsia"/>
-        </w:rPr>
-        <w:t xml:space="preserve"> </w:t>
-      </w:r>
-      <w:proofErr w:type="spellStart"/>
-      <w:r>
-        <w:rPr>
-          <w:rFonts w:hint="eastAsia"/>
-        </w:rPr>
-        <w:t>DecisionTask</w:t>
-      </w:r>
-      <w:proofErr w:type="spellEnd"/>
-      <w:r>
-        <w:rPr>
-          <w:rFonts w:hint="eastAsia"/>
-        </w:rPr>
-        <w:t xml:space="preserve"> (ROCOF values)</w:t>
-      </w:r>
-    </w:p>
-    <w:p>
-      <w:pPr>
-        <w:rPr>
-          <w:rFonts w:hint="eastAsia"/>
-        </w:rPr>
-      </w:pPr>
-      <w:r>
-        <w:rPr>
-          <w:rFonts w:hint="eastAsia"/>
-        </w:rPr>
-        <w:t xml:space="preserve">- </w:t>
-      </w:r>
-      <w:proofErr w:type="spellStart"/>
-      <w:r>
-        <w:rPr>
-          <w:rFonts w:hint="eastAsia"/>
-        </w:rPr>
-        <w:t>DecisionTask</w:t>
-      </w:r>
-      <w:proofErr w:type="spellEnd"/>
-      <w:r>
-        <w:rPr>
-          <w:rFonts w:hint="eastAsia"/>
-        </w:rPr>
-        <w:t xml:space="preserve"> </w:t>
-      </w:r>
-      <w:r>
-        <w:rPr>
-          <w:rFonts w:hint="eastAsia"/>
-        </w:rPr>
-        <w:t>→</w:t>
-      </w:r>
-      <w:r>
-        <w:rPr>
-          <w:rFonts w:hint="eastAsia"/>
-        </w:rPr>
-        <w:t xml:space="preserve"> </w:t>
-      </w:r>
-      <w:proofErr w:type="spellStart"/>
-      <w:r>
-        <w:rPr>
-          <w:rFonts w:hint="eastAsia"/>
-        </w:rPr>
-        <w:t>LoadControlTask</w:t>
-      </w:r>
-      <w:proofErr w:type="spellEnd"/>
-      <w:r>
-        <w:rPr>
-          <w:rFonts w:hint="eastAsia"/>
-        </w:rPr>
-        <w:t xml:space="preserve"> (load commands)</w:t>
-      </w:r>
-    </w:p>
-    <w:p>
-      <w:pPr>
-        <w:rPr>
-          <w:rFonts w:hint="eastAsia"/>
-        </w:rPr>
-      </w:pPr>
-      <w:r>
-        <w:rPr>
-          <w:rFonts w:hint="eastAsia"/>
-        </w:rPr>
-        <w:t xml:space="preserve">- </w:t>
-      </w:r>
       <w:proofErr w:type="spellStart"/>
       <w:r>
         <w:rPr>
@@ -954,7 +993,19 @@
     </w:p>
     <w:p>
       <w:r>
-        <w:t>Shared variables are minimised, and where used, access is controlled through structured task interactions.</w:t>
+        <w:t>Shared variables are minimised, and where they are used, access is controlled through structured task interactions.</w:t>
+      </w:r>
+    </w:p>
+    <w:p>
+      <w:r>
+        <w:lastRenderedPageBreak/>
+        <w:t>Queues were selected over shared variables with mutex protection because they provide both communication and synchronisation in a single mechanism. This reduces the likelihood of race conditions and simplifies system design.</w:t>
+      </w:r>
+    </w:p>
+    <w:p/>
+    <w:p>
+      <w:r>
+        <w:t>Mutexes or critical sections were considered for protecting shared variables; however, they introduce additional complexity and risk of priority inversion. By structuring the system around queues, direct shared memory access is minimised.</w:t>
       </w:r>
     </w:p>
     <w:p>
@@ -1021,7 +1072,6 @@
       </w:pPr>
       <w:proofErr w:type="spellStart"/>
       <w:r>
-        <w:lastRenderedPageBreak/>
         <w:t>FrequencyTask</w:t>
       </w:r>
       <w:proofErr w:type="spellEnd"/>
@@ -1131,12 +1181,6 @@
       </w:r>
     </w:p>
     <w:p>
-      <w:pPr>
-        <w:rPr>
-          <w:b/>
-          <w:bCs/>
-        </w:rPr>
-      </w:pPr>
       <w:r>
         <w:t xml:space="preserve">The system ensures that the first load shedding occurs within 200 </w:t>
       </w:r>
@@ -1156,6 +1200,14 @@
       <w:r>
         <w:t xml:space="preserve"> observation interval used for subsequent actions.</w:t>
       </w:r>
+    </w:p>
+    <w:p>
+      <w:pPr>
+        <w:rPr>
+          <w:b/>
+          <w:bCs/>
+        </w:rPr>
+      </w:pPr>
       <w:r>
         <w:rPr>
           <w:b/>
@@ -1179,6 +1231,14 @@
         </w:rPr>
         <w:t xml:space="preserve"> Load Management</w:t>
       </w:r>
+    </w:p>
+    <w:p>
+      <w:pPr>
+        <w:rPr>
+          <w:b/>
+          <w:bCs/>
+        </w:rPr>
+      </w:pPr>
     </w:p>
     <w:p>
       <w:r>
@@ -1225,6 +1285,7 @@
     </w:p>
     <w:p>
       <w:r>
+        <w:lastRenderedPageBreak/>
         <w:t>This behaviour is implemented using periodic timers and state tracking.</w:t>
       </w:r>
     </w:p>
@@ -1309,6 +1370,61 @@
       <w:r>
         <w:t>The use of these features demonstrates correct application of real-time operating system principles.</w:t>
       </w:r>
+      <w:r>
+        <w:br/>
+      </w:r>
+      <w:r>
+        <w:br/>
+        <w:t>In addition, several potential multitasking issues were addressed:</w:t>
+      </w:r>
+    </w:p>
+    <w:p>
+      <w:pPr>
+        <w:pStyle w:val="ListParagraph"/>
+        <w:numPr>
+          <w:ilvl w:val="0"/>
+          <w:numId w:val="13"/>
+        </w:numPr>
+      </w:pPr>
+      <w:r>
+        <w:t>Race conditions were avoided by using queues instead of shared variables.</w:t>
+      </w:r>
+    </w:p>
+    <w:p>
+      <w:pPr>
+        <w:pStyle w:val="ListParagraph"/>
+        <w:numPr>
+          <w:ilvl w:val="0"/>
+          <w:numId w:val="13"/>
+        </w:numPr>
+      </w:pPr>
+      <w:r>
+        <w:t>Inconsistent state updates were prevented by ensuring only one task is responsible for modifying load control decisions.</w:t>
+      </w:r>
+    </w:p>
+    <w:p>
+      <w:pPr>
+        <w:pStyle w:val="ListParagraph"/>
+        <w:numPr>
+          <w:ilvl w:val="0"/>
+          <w:numId w:val="13"/>
+        </w:numPr>
+      </w:pPr>
+      <w:r>
+        <w:t>Timing interference between tasks was reduced through appropriate priority assignment.</w:t>
+      </w:r>
+    </w:p>
+    <w:p>
+      <w:pPr>
+        <w:pStyle w:val="ListParagraph"/>
+        <w:numPr>
+          <w:ilvl w:val="0"/>
+          <w:numId w:val="13"/>
+        </w:numPr>
+      </w:pPr>
+      <w:r>
+        <w:t>ISR-to-task communication was handled using ISR-safe queue functions to prevent corruption of shared data.</w:t>
+      </w:r>
     </w:p>
     <w:p>
       <w:pPr>
@@ -1359,10 +1475,13 @@
     </w:p>
     <w:p>
       <w:r>
-        <w:lastRenderedPageBreak/>
-        <w:t>Note: Some display features, including detailed statistics and history tracking, are not fully implemented and are identified as future work.</w:t>
-      </w:r>
-    </w:p>
+        <w:t>Note that some display features</w:t>
+      </w:r>
+      <w:r>
+        <w:t>, including detailed statistics and history tracking, are not fully implemented and are identified as future work.</w:t>
+      </w:r>
+    </w:p>
+    <w:p/>
     <w:p>
       <w:pPr>
         <w:rPr>
@@ -1421,6 +1540,29 @@
         <w:t>These limitations do not affect core system functionality but reduce usability.</w:t>
       </w:r>
     </w:p>
+    <w:p>
+      <w:r>
+        <w:lastRenderedPageBreak/>
+        <w:t>An identified design issue is the reliance on periodic task execution for decision and load control, which introduces bounded latency between detection and output. While this meets the timing requirements, a more tightly coupled event-driven approach could reduce latency further.</w:t>
+      </w:r>
+    </w:p>
+    <w:p>
+      <w:r>
+        <w:t>Additionally, the separation of logic across multiple tasks increases system complexity and requires careful coordination to maintain consistency of shared state.</w:t>
+      </w:r>
+    </w:p>
+    <w:p>
+      <w:r>
+        <w:t>The assignment requires maintaining a running record of timing measurements, including the five most recent values, minimum, maximum, average, and total runtime.</w:t>
+      </w:r>
+    </w:p>
+    <w:p/>
+    <w:p>
+      <w:r>
+        <w:t>This functionality is partially implemented; however, full integration with the display system remains as future work.</w:t>
+      </w:r>
+    </w:p>
+    <w:p/>
     <w:p>
       <w:pPr>
         <w:rPr>
@@ -1794,7 +1936,21 @@
     </w:p>
     <w:p>
       <w:r>
-        <w:t xml:space="preserve">The LCFR system demonstrates a complete embedded real-time solution integrating hardware and software components. The use of </w:t>
+        <w:t>The LCFR implementation demonstrates a complete embedded real-time solution</w:t>
+      </w:r>
+      <w:r>
+        <w:t xml:space="preserve"> </w:t>
+      </w:r>
+      <w:proofErr w:type="gramStart"/>
+      <w:r>
+        <w:t>using  both</w:t>
+      </w:r>
+      <w:proofErr w:type="gramEnd"/>
+      <w:r>
+        <w:t xml:space="preserve"> </w:t>
+      </w:r>
+      <w:r>
+        <w:t xml:space="preserve">hardware and software components. The use of </w:t>
       </w:r>
       <w:proofErr w:type="spellStart"/>
       <w:r>
@@ -1802,7 +1958,11 @@
       </w:r>
       <w:proofErr w:type="spellEnd"/>
       <w:r>
-        <w:t xml:space="preserve"> enables efficient multitasking and real-time responsiveness. While some interface features remain incomplete, the system successfully meets the core functional and timing requirements.</w:t>
+        <w:t xml:space="preserve"> enables efficient multitasking and real-time responsiveness. While some interface features remain </w:t>
+      </w:r>
+      <w:r>
+        <w:lastRenderedPageBreak/>
+        <w:t>incomplete, the system successfully meets the core functional and timing requirements.</w:t>
       </w:r>
     </w:p>
     <w:p>
@@ -1839,7 +1999,6 @@
         </w:numPr>
       </w:pPr>
       <w:r>
-        <w:lastRenderedPageBreak/>
         <w:t>Implement full statistical tracking (last five values, minimum, maximum, average)</w:t>
       </w:r>
     </w:p>
@@ -1879,6 +2038,118 @@
 <file path=word/numbering.xml><?xml version="1.0" encoding="utf-8"?>
 <w:numbering xmlns:wpc="http://schemas.microsoft.com/office/word/2010/wordprocessingCanvas" xmlns:cx="http://schemas.microsoft.com/office/drawing/2014/chartex" xmlns:cx1="http://schemas.microsoft.com/office/drawing/2015/9/8/chartex" xmlns:cx2="http://schemas.microsoft.com/office/drawing/2015/10/21/chartex" xmlns:cx3="http://schemas.microsoft.com/office/drawing/2016/5/9/chartex" xmlns:cx4="http://schemas.microsoft.com/office/drawing/2016/5/10/chartex" xmlns:cx5="http://schemas.microsoft.com/office/drawing/2016/5/11/chartex" xmlns:cx6="http://schemas.microsoft.com/office/drawing/2016/5/12/chartex" xmlns:cx7="http://schemas.microsoft.com/office/drawing/2016/5/13/chartex" xmlns:cx8="http://schemas.microsoft.com/office/drawing/2016/5/14/chartex" xmlns:mc="http://schemas.openxmlformats.org/markup-compatibility/2006" xmlns:aink="http://schemas.microsoft.com/office/drawing/2016/ink" xmlns:am3d="http://schemas.microsoft.com/office/drawing/2017/model3d" xmlns:o="urn:schemas-microsoft-com:office:office" xmlns:oel="http://schemas.microsoft.com/office/2019/extlst" xmlns:r="http://schemas.openxmlformats.org/officeDocument/2006/relationships" xmlns:m="http://schemas.openxmlformats.org/officeDocument/2006/math" xmlns:v="urn:schemas-microsoft-com:vml" xmlns:wp14="http://schemas.microsoft.com/office/word/2010/wordprocessingDrawing" xmlns:wp="http://schemas.openxmlformats.org/drawingml/2006/wordprocessingDrawing" xmlns:w10="urn:schemas-microsoft-com:office:word" xmlns:w="http://schemas.openxmlformats.org/wordprocessingml/2006/main" xmlns:w14="http://schemas.microsoft.com/office/word/2010/wordml" xmlns:w15="http://schemas.microsoft.com/office/word/2012/wordml" xmlns:w16cex="http://schemas.microsoft.com/office/word/2018/wordml/cex" xmlns:w16cid="http://schemas.microsoft.com/office/word/2016/wordml/cid" xmlns:w16="http://schemas.microsoft.com/office/word/2018/wordml" xmlns:w16du="http://schemas.microsoft.com/office/word/2023/wordml/word16du" xmlns:w16sdtdh="http://schemas.microsoft.com/office/word/2020/wordml/sdtdatahash" xmlns:w16sdtfl="http://schemas.microsoft.com/office/word/2024/wordml/sdtformatlock" xmlns:w16se="http://schemas.microsoft.com/office/word/2015/wordml/symex" xmlns:wpg="http://schemas.microsoft.com/office/word/2010/wordprocessingGroup" xmlns:wpi="http://schemas.microsoft.com/office/word/2010/wordprocessingInk" xmlns:wne="http://schemas.microsoft.com/office/word/2006/wordml" xmlns:wps="http://schemas.microsoft.com/office/word/2010/wordprocessingShape" mc:Ignorable="w14 w15 w16se w16cid w16 w16cex w16sdtdh w16sdtfl w16du wp14">
   <w:abstractNum w:abstractNumId="0" w15:restartNumberingAfterBreak="0">
+    <w:nsid w:val="09EA0A8F"/>
+    <w:multiLevelType w:val="hybridMultilevel"/>
+    <w:tmpl w:val="48902822"/>
+    <w:lvl w:ilvl="0" w:tplc="1E1C5D06">
+      <w:numFmt w:val="bullet"/>
+      <w:lvlText w:val="-"/>
+      <w:lvlJc w:val="left"/>
+      <w:pPr>
+        <w:ind w:left="720" w:hanging="360"/>
+      </w:pPr>
+      <w:rPr>
+        <w:rFonts w:ascii="Aptos" w:eastAsiaTheme="minorEastAsia" w:hAnsi="Aptos" w:cstheme="minorBidi" w:hint="default"/>
+      </w:rPr>
+    </w:lvl>
+    <w:lvl w:ilvl="1" w:tplc="14090003" w:tentative="1">
+      <w:start w:val="1"/>
+      <w:numFmt w:val="bullet"/>
+      <w:lvlText w:val="o"/>
+      <w:lvlJc w:val="left"/>
+      <w:pPr>
+        <w:ind w:left="1440" w:hanging="360"/>
+      </w:pPr>
+      <w:rPr>
+        <w:rFonts w:ascii="Courier New" w:hAnsi="Courier New" w:cs="Courier New" w:hint="default"/>
+      </w:rPr>
+    </w:lvl>
+    <w:lvl w:ilvl="2" w:tplc="14090005" w:tentative="1">
+      <w:start w:val="1"/>
+      <w:numFmt w:val="bullet"/>
+      <w:lvlText w:val=""/>
+      <w:lvlJc w:val="left"/>
+      <w:pPr>
+        <w:ind w:left="2160" w:hanging="360"/>
+      </w:pPr>
+      <w:rPr>
+        <w:rFonts w:ascii="Wingdings" w:hAnsi="Wingdings" w:hint="default"/>
+      </w:rPr>
+    </w:lvl>
+    <w:lvl w:ilvl="3" w:tplc="14090001" w:tentative="1">
+      <w:start w:val="1"/>
+      <w:numFmt w:val="bullet"/>
+      <w:lvlText w:val=""/>
+      <w:lvlJc w:val="left"/>
+      <w:pPr>
+        <w:ind w:left="2880" w:hanging="360"/>
+      </w:pPr>
+      <w:rPr>
+        <w:rFonts w:ascii="Symbol" w:hAnsi="Symbol" w:hint="default"/>
+      </w:rPr>
+    </w:lvl>
+    <w:lvl w:ilvl="4" w:tplc="14090003" w:tentative="1">
+      <w:start w:val="1"/>
+      <w:numFmt w:val="bullet"/>
+      <w:lvlText w:val="o"/>
+      <w:lvlJc w:val="left"/>
+      <w:pPr>
+        <w:ind w:left="3600" w:hanging="360"/>
+      </w:pPr>
+      <w:rPr>
+        <w:rFonts w:ascii="Courier New" w:hAnsi="Courier New" w:cs="Courier New" w:hint="default"/>
+      </w:rPr>
+    </w:lvl>
+    <w:lvl w:ilvl="5" w:tplc="14090005" w:tentative="1">
+      <w:start w:val="1"/>
+      <w:numFmt w:val="bullet"/>
+      <w:lvlText w:val=""/>
+      <w:lvlJc w:val="left"/>
+      <w:pPr>
+        <w:ind w:left="4320" w:hanging="360"/>
+      </w:pPr>
+      <w:rPr>
+        <w:rFonts w:ascii="Wingdings" w:hAnsi="Wingdings" w:hint="default"/>
+      </w:rPr>
+    </w:lvl>
+    <w:lvl w:ilvl="6" w:tplc="14090001" w:tentative="1">
+      <w:start w:val="1"/>
+      <w:numFmt w:val="bullet"/>
+      <w:lvlText w:val=""/>
+      <w:lvlJc w:val="left"/>
+      <w:pPr>
+        <w:ind w:left="5040" w:hanging="360"/>
+      </w:pPr>
+      <w:rPr>
+        <w:rFonts w:ascii="Symbol" w:hAnsi="Symbol" w:hint="default"/>
+      </w:rPr>
+    </w:lvl>
+    <w:lvl w:ilvl="7" w:tplc="14090003" w:tentative="1">
+      <w:start w:val="1"/>
+      <w:numFmt w:val="bullet"/>
+      <w:lvlText w:val="o"/>
+      <w:lvlJc w:val="left"/>
+      <w:pPr>
+        <w:ind w:left="5760" w:hanging="360"/>
+      </w:pPr>
+      <w:rPr>
+        <w:rFonts w:ascii="Courier New" w:hAnsi="Courier New" w:cs="Courier New" w:hint="default"/>
+      </w:rPr>
+    </w:lvl>
+    <w:lvl w:ilvl="8" w:tplc="14090005" w:tentative="1">
+      <w:start w:val="1"/>
+      <w:numFmt w:val="bullet"/>
+      <w:lvlText w:val=""/>
+      <w:lvlJc w:val="left"/>
+      <w:pPr>
+        <w:ind w:left="6480" w:hanging="360"/>
+      </w:pPr>
+      <w:rPr>
+        <w:rFonts w:ascii="Wingdings" w:hAnsi="Wingdings" w:hint="default"/>
+      </w:rPr>
+    </w:lvl>
+  </w:abstractNum>
+  <w:abstractNum w:abstractNumId="1" w15:restartNumberingAfterBreak="0">
     <w:nsid w:val="1ADA5FC7"/>
     <w:multiLevelType w:val="multilevel"/>
     <w:tmpl w:val="2368AC42"/>
@@ -2027,7 +2298,7 @@
       </w:rPr>
     </w:lvl>
   </w:abstractNum>
-  <w:abstractNum w:abstractNumId="1" w15:restartNumberingAfterBreak="0">
+  <w:abstractNum w:abstractNumId="2" w15:restartNumberingAfterBreak="0">
     <w:nsid w:val="203F3798"/>
     <w:multiLevelType w:val="multilevel"/>
     <w:tmpl w:val="1A687E08"/>
@@ -2176,7 +2447,7 @@
       </w:rPr>
     </w:lvl>
   </w:abstractNum>
-  <w:abstractNum w:abstractNumId="2" w15:restartNumberingAfterBreak="0">
+  <w:abstractNum w:abstractNumId="3" w15:restartNumberingAfterBreak="0">
     <w:nsid w:val="253235C6"/>
     <w:multiLevelType w:val="multilevel"/>
     <w:tmpl w:val="32962816"/>
@@ -2325,7 +2596,7 @@
       </w:rPr>
     </w:lvl>
   </w:abstractNum>
-  <w:abstractNum w:abstractNumId="3" w15:restartNumberingAfterBreak="0">
+  <w:abstractNum w:abstractNumId="4" w15:restartNumberingAfterBreak="0">
     <w:nsid w:val="271D2F05"/>
     <w:multiLevelType w:val="multilevel"/>
     <w:tmpl w:val="196C8AAA"/>
@@ -2474,7 +2745,120 @@
       </w:rPr>
     </w:lvl>
   </w:abstractNum>
-  <w:abstractNum w:abstractNumId="4" w15:restartNumberingAfterBreak="0">
+  <w:abstractNum w:abstractNumId="5" w15:restartNumberingAfterBreak="0">
+    <w:nsid w:val="30834BCC"/>
+    <w:multiLevelType w:val="hybridMultilevel"/>
+    <w:tmpl w:val="13F86C32"/>
+    <w:lvl w:ilvl="0" w:tplc="14090001">
+      <w:start w:val="1"/>
+      <w:numFmt w:val="bullet"/>
+      <w:lvlText w:val=""/>
+      <w:lvlJc w:val="left"/>
+      <w:pPr>
+        <w:ind w:left="720" w:hanging="360"/>
+      </w:pPr>
+      <w:rPr>
+        <w:rFonts w:ascii="Symbol" w:hAnsi="Symbol" w:hint="default"/>
+      </w:rPr>
+    </w:lvl>
+    <w:lvl w:ilvl="1" w:tplc="14090003" w:tentative="1">
+      <w:start w:val="1"/>
+      <w:numFmt w:val="bullet"/>
+      <w:lvlText w:val="o"/>
+      <w:lvlJc w:val="left"/>
+      <w:pPr>
+        <w:ind w:left="1440" w:hanging="360"/>
+      </w:pPr>
+      <w:rPr>
+        <w:rFonts w:ascii="Courier New" w:hAnsi="Courier New" w:cs="Courier New" w:hint="default"/>
+      </w:rPr>
+    </w:lvl>
+    <w:lvl w:ilvl="2" w:tplc="14090005" w:tentative="1">
+      <w:start w:val="1"/>
+      <w:numFmt w:val="bullet"/>
+      <w:lvlText w:val=""/>
+      <w:lvlJc w:val="left"/>
+      <w:pPr>
+        <w:ind w:left="2160" w:hanging="360"/>
+      </w:pPr>
+      <w:rPr>
+        <w:rFonts w:ascii="Wingdings" w:hAnsi="Wingdings" w:hint="default"/>
+      </w:rPr>
+    </w:lvl>
+    <w:lvl w:ilvl="3" w:tplc="14090001" w:tentative="1">
+      <w:start w:val="1"/>
+      <w:numFmt w:val="bullet"/>
+      <w:lvlText w:val=""/>
+      <w:lvlJc w:val="left"/>
+      <w:pPr>
+        <w:ind w:left="2880" w:hanging="360"/>
+      </w:pPr>
+      <w:rPr>
+        <w:rFonts w:ascii="Symbol" w:hAnsi="Symbol" w:hint="default"/>
+      </w:rPr>
+    </w:lvl>
+    <w:lvl w:ilvl="4" w:tplc="14090003" w:tentative="1">
+      <w:start w:val="1"/>
+      <w:numFmt w:val="bullet"/>
+      <w:lvlText w:val="o"/>
+      <w:lvlJc w:val="left"/>
+      <w:pPr>
+        <w:ind w:left="3600" w:hanging="360"/>
+      </w:pPr>
+      <w:rPr>
+        <w:rFonts w:ascii="Courier New" w:hAnsi="Courier New" w:cs="Courier New" w:hint="default"/>
+      </w:rPr>
+    </w:lvl>
+    <w:lvl w:ilvl="5" w:tplc="14090005" w:tentative="1">
+      <w:start w:val="1"/>
+      <w:numFmt w:val="bullet"/>
+      <w:lvlText w:val=""/>
+      <w:lvlJc w:val="left"/>
+      <w:pPr>
+        <w:ind w:left="4320" w:hanging="360"/>
+      </w:pPr>
+      <w:rPr>
+        <w:rFonts w:ascii="Wingdings" w:hAnsi="Wingdings" w:hint="default"/>
+      </w:rPr>
+    </w:lvl>
+    <w:lvl w:ilvl="6" w:tplc="14090001" w:tentative="1">
+      <w:start w:val="1"/>
+      <w:numFmt w:val="bullet"/>
+      <w:lvlText w:val=""/>
+      <w:lvlJc w:val="left"/>
+      <w:pPr>
+        <w:ind w:left="5040" w:hanging="360"/>
+      </w:pPr>
+      <w:rPr>
+        <w:rFonts w:ascii="Symbol" w:hAnsi="Symbol" w:hint="default"/>
+      </w:rPr>
+    </w:lvl>
+    <w:lvl w:ilvl="7" w:tplc="14090003" w:tentative="1">
+      <w:start w:val="1"/>
+      <w:numFmt w:val="bullet"/>
+      <w:lvlText w:val="o"/>
+      <w:lvlJc w:val="left"/>
+      <w:pPr>
+        <w:ind w:left="5760" w:hanging="360"/>
+      </w:pPr>
+      <w:rPr>
+        <w:rFonts w:ascii="Courier New" w:hAnsi="Courier New" w:cs="Courier New" w:hint="default"/>
+      </w:rPr>
+    </w:lvl>
+    <w:lvl w:ilvl="8" w:tplc="14090005" w:tentative="1">
+      <w:start w:val="1"/>
+      <w:numFmt w:val="bullet"/>
+      <w:lvlText w:val=""/>
+      <w:lvlJc w:val="left"/>
+      <w:pPr>
+        <w:ind w:left="6480" w:hanging="360"/>
+      </w:pPr>
+      <w:rPr>
+        <w:rFonts w:ascii="Wingdings" w:hAnsi="Wingdings" w:hint="default"/>
+      </w:rPr>
+    </w:lvl>
+  </w:abstractNum>
+  <w:abstractNum w:abstractNumId="6" w15:restartNumberingAfterBreak="0">
     <w:nsid w:val="4B217DAF"/>
     <w:multiLevelType w:val="multilevel"/>
     <w:tmpl w:val="EE5A86B2"/>
@@ -2587,7 +2971,7 @@
       </w:pPr>
     </w:lvl>
   </w:abstractNum>
-  <w:abstractNum w:abstractNumId="5" w15:restartNumberingAfterBreak="0">
+  <w:abstractNum w:abstractNumId="7" w15:restartNumberingAfterBreak="0">
     <w:nsid w:val="4C6E58AF"/>
     <w:multiLevelType w:val="multilevel"/>
     <w:tmpl w:val="DAB866DC"/>
@@ -2736,7 +3120,7 @@
       </w:rPr>
     </w:lvl>
   </w:abstractNum>
-  <w:abstractNum w:abstractNumId="6" w15:restartNumberingAfterBreak="0">
+  <w:abstractNum w:abstractNumId="8" w15:restartNumberingAfterBreak="0">
     <w:nsid w:val="4DC546D4"/>
     <w:multiLevelType w:val="multilevel"/>
     <w:tmpl w:val="068A1606"/>
@@ -2885,7 +3269,7 @@
       </w:rPr>
     </w:lvl>
   </w:abstractNum>
-  <w:abstractNum w:abstractNumId="7" w15:restartNumberingAfterBreak="0">
+  <w:abstractNum w:abstractNumId="9" w15:restartNumberingAfterBreak="0">
     <w:nsid w:val="573561D0"/>
     <w:multiLevelType w:val="multilevel"/>
     <w:tmpl w:val="71FEB382"/>
@@ -3034,7 +3418,7 @@
       </w:rPr>
     </w:lvl>
   </w:abstractNum>
-  <w:abstractNum w:abstractNumId="8" w15:restartNumberingAfterBreak="0">
+  <w:abstractNum w:abstractNumId="10" w15:restartNumberingAfterBreak="0">
     <w:nsid w:val="67C37603"/>
     <w:multiLevelType w:val="multilevel"/>
     <w:tmpl w:val="3EBAE1BC"/>
@@ -3183,7 +3567,7 @@
       </w:rPr>
     </w:lvl>
   </w:abstractNum>
-  <w:abstractNum w:abstractNumId="9" w15:restartNumberingAfterBreak="0">
+  <w:abstractNum w:abstractNumId="11" w15:restartNumberingAfterBreak="0">
     <w:nsid w:val="6AAB7E1F"/>
     <w:multiLevelType w:val="multilevel"/>
     <w:tmpl w:val="8340B672"/>
@@ -3332,7 +3716,120 @@
       </w:rPr>
     </w:lvl>
   </w:abstractNum>
-  <w:abstractNum w:abstractNumId="10" w15:restartNumberingAfterBreak="0">
+  <w:abstractNum w:abstractNumId="12" w15:restartNumberingAfterBreak="0">
+    <w:nsid w:val="771D66AA"/>
+    <w:multiLevelType w:val="hybridMultilevel"/>
+    <w:tmpl w:val="8592A46A"/>
+    <w:lvl w:ilvl="0" w:tplc="14090001">
+      <w:start w:val="1"/>
+      <w:numFmt w:val="bullet"/>
+      <w:lvlText w:val=""/>
+      <w:lvlJc w:val="left"/>
+      <w:pPr>
+        <w:ind w:left="720" w:hanging="360"/>
+      </w:pPr>
+      <w:rPr>
+        <w:rFonts w:ascii="Symbol" w:hAnsi="Symbol" w:hint="default"/>
+      </w:rPr>
+    </w:lvl>
+    <w:lvl w:ilvl="1" w:tplc="14090003" w:tentative="1">
+      <w:start w:val="1"/>
+      <w:numFmt w:val="bullet"/>
+      <w:lvlText w:val="o"/>
+      <w:lvlJc w:val="left"/>
+      <w:pPr>
+        <w:ind w:left="1440" w:hanging="360"/>
+      </w:pPr>
+      <w:rPr>
+        <w:rFonts w:ascii="Courier New" w:hAnsi="Courier New" w:cs="Courier New" w:hint="default"/>
+      </w:rPr>
+    </w:lvl>
+    <w:lvl w:ilvl="2" w:tplc="14090005" w:tentative="1">
+      <w:start w:val="1"/>
+      <w:numFmt w:val="bullet"/>
+      <w:lvlText w:val=""/>
+      <w:lvlJc w:val="left"/>
+      <w:pPr>
+        <w:ind w:left="2160" w:hanging="360"/>
+      </w:pPr>
+      <w:rPr>
+        <w:rFonts w:ascii="Wingdings" w:hAnsi="Wingdings" w:hint="default"/>
+      </w:rPr>
+    </w:lvl>
+    <w:lvl w:ilvl="3" w:tplc="14090001" w:tentative="1">
+      <w:start w:val="1"/>
+      <w:numFmt w:val="bullet"/>
+      <w:lvlText w:val=""/>
+      <w:lvlJc w:val="left"/>
+      <w:pPr>
+        <w:ind w:left="2880" w:hanging="360"/>
+      </w:pPr>
+      <w:rPr>
+        <w:rFonts w:ascii="Symbol" w:hAnsi="Symbol" w:hint="default"/>
+      </w:rPr>
+    </w:lvl>
+    <w:lvl w:ilvl="4" w:tplc="14090003" w:tentative="1">
+      <w:start w:val="1"/>
+      <w:numFmt w:val="bullet"/>
+      <w:lvlText w:val="o"/>
+      <w:lvlJc w:val="left"/>
+      <w:pPr>
+        <w:ind w:left="3600" w:hanging="360"/>
+      </w:pPr>
+      <w:rPr>
+        <w:rFonts w:ascii="Courier New" w:hAnsi="Courier New" w:cs="Courier New" w:hint="default"/>
+      </w:rPr>
+    </w:lvl>
+    <w:lvl w:ilvl="5" w:tplc="14090005" w:tentative="1">
+      <w:start w:val="1"/>
+      <w:numFmt w:val="bullet"/>
+      <w:lvlText w:val=""/>
+      <w:lvlJc w:val="left"/>
+      <w:pPr>
+        <w:ind w:left="4320" w:hanging="360"/>
+      </w:pPr>
+      <w:rPr>
+        <w:rFonts w:ascii="Wingdings" w:hAnsi="Wingdings" w:hint="default"/>
+      </w:rPr>
+    </w:lvl>
+    <w:lvl w:ilvl="6" w:tplc="14090001" w:tentative="1">
+      <w:start w:val="1"/>
+      <w:numFmt w:val="bullet"/>
+      <w:lvlText w:val=""/>
+      <w:lvlJc w:val="left"/>
+      <w:pPr>
+        <w:ind w:left="5040" w:hanging="360"/>
+      </w:pPr>
+      <w:rPr>
+        <w:rFonts w:ascii="Symbol" w:hAnsi="Symbol" w:hint="default"/>
+      </w:rPr>
+    </w:lvl>
+    <w:lvl w:ilvl="7" w:tplc="14090003" w:tentative="1">
+      <w:start w:val="1"/>
+      <w:numFmt w:val="bullet"/>
+      <w:lvlText w:val="o"/>
+      <w:lvlJc w:val="left"/>
+      <w:pPr>
+        <w:ind w:left="5760" w:hanging="360"/>
+      </w:pPr>
+      <w:rPr>
+        <w:rFonts w:ascii="Courier New" w:hAnsi="Courier New" w:cs="Courier New" w:hint="default"/>
+      </w:rPr>
+    </w:lvl>
+    <w:lvl w:ilvl="8" w:tplc="14090005" w:tentative="1">
+      <w:start w:val="1"/>
+      <w:numFmt w:val="bullet"/>
+      <w:lvlText w:val=""/>
+      <w:lvlJc w:val="left"/>
+      <w:pPr>
+        <w:ind w:left="6480" w:hanging="360"/>
+      </w:pPr>
+      <w:rPr>
+        <w:rFonts w:ascii="Wingdings" w:hAnsi="Wingdings" w:hint="default"/>
+      </w:rPr>
+    </w:lvl>
+  </w:abstractNum>
+  <w:abstractNum w:abstractNumId="13" w15:restartNumberingAfterBreak="0">
     <w:nsid w:val="7B611CE9"/>
     <w:multiLevelType w:val="hybridMultilevel"/>
     <w:tmpl w:val="8D4AB300"/>
@@ -3445,7 +3942,7 @@
       </w:rPr>
     </w:lvl>
   </w:abstractNum>
-  <w:abstractNum w:abstractNumId="11" w15:restartNumberingAfterBreak="0">
+  <w:abstractNum w:abstractNumId="14" w15:restartNumberingAfterBreak="0">
     <w:nsid w:val="7C7F61E5"/>
     <w:multiLevelType w:val="multilevel"/>
     <w:tmpl w:val="CDDE459C"/>
@@ -3559,40 +4056,49 @@
     </w:lvl>
   </w:abstractNum>
   <w:num w:numId="1" w16cid:durableId="1811054148">
+    <w:abstractNumId w:val="14"/>
+  </w:num>
+  <w:num w:numId="2" w16cid:durableId="604267609">
+    <w:abstractNumId w:val="8"/>
+  </w:num>
+  <w:num w:numId="3" w16cid:durableId="1106659885">
+    <w:abstractNumId w:val="10"/>
+  </w:num>
+  <w:num w:numId="4" w16cid:durableId="1611157696">
     <w:abstractNumId w:val="11"/>
   </w:num>
-  <w:num w:numId="2" w16cid:durableId="604267609">
+  <w:num w:numId="5" w16cid:durableId="1778257320">
+    <w:abstractNumId w:val="1"/>
+  </w:num>
+  <w:num w:numId="6" w16cid:durableId="492261149">
+    <w:abstractNumId w:val="3"/>
+  </w:num>
+  <w:num w:numId="7" w16cid:durableId="443355204">
+    <w:abstractNumId w:val="9"/>
+  </w:num>
+  <w:num w:numId="8" w16cid:durableId="38669003">
+    <w:abstractNumId w:val="4"/>
+  </w:num>
+  <w:num w:numId="9" w16cid:durableId="1207835094">
+    <w:abstractNumId w:val="7"/>
+  </w:num>
+  <w:num w:numId="10" w16cid:durableId="2122845399">
     <w:abstractNumId w:val="6"/>
   </w:num>
-  <w:num w:numId="3" w16cid:durableId="1106659885">
-    <w:abstractNumId w:val="8"/>
-  </w:num>
-  <w:num w:numId="4" w16cid:durableId="1611157696">
-    <w:abstractNumId w:val="9"/>
-  </w:num>
-  <w:num w:numId="5" w16cid:durableId="1778257320">
-    <w:abstractNumId w:val="0"/>
-  </w:num>
-  <w:num w:numId="6" w16cid:durableId="492261149">
+  <w:num w:numId="11" w16cid:durableId="945380374">
     <w:abstractNumId w:val="2"/>
   </w:num>
-  <w:num w:numId="7" w16cid:durableId="443355204">
-    <w:abstractNumId w:val="7"/>
+  <w:num w:numId="12" w16cid:durableId="675233985">
+    <w:abstractNumId w:val="13"/>
   </w:num>
-  <w:num w:numId="8" w16cid:durableId="38669003">
-    <w:abstractNumId w:val="3"/>
-  </w:num>
-  <w:num w:numId="9" w16cid:durableId="1207835094">
+  <w:num w:numId="13" w16cid:durableId="1711492548">
     <w:abstractNumId w:val="5"/>
   </w:num>
-  <w:num w:numId="10" w16cid:durableId="2122845399">
-    <w:abstractNumId w:val="4"/>
+  <w:num w:numId="14" w16cid:durableId="248083616">
+    <w:abstractNumId w:val="12"/>
   </w:num>
-  <w:num w:numId="11" w16cid:durableId="945380374">
-    <w:abstractNumId w:val="1"/>
-  </w:num>
-  <w:num w:numId="12" w16cid:durableId="675233985">
-    <w:abstractNumId w:val="10"/>
+  <w:num w:numId="15" w16cid:durableId="171913656">
+    <w:abstractNumId w:val="0"/>
   </w:num>
 </w:numbering>
 </file>
@@ -3997,6 +4503,7 @@
   <w:style w:type="paragraph" w:default="1" w:styleId="Normal">
     <w:name w:val="Normal"/>
     <w:qFormat/>
+    <w:rsid w:val="006C6F80"/>
   </w:style>
   <w:style w:type="paragraph" w:styleId="Heading1">
     <w:name w:val="heading 1"/>

</xml_diff>